<commit_message>
docs v1.8.1: RF-004f cierre al cerrar navegador, ADR-17 enmendado, US-045, REPORTE_7 (F-27, T-17..T-19)
</commit_message>
<xml_diff>
--- a/Evidencias y Documentacion/Ingenieria_Inversa_v1.8.0.docx
+++ b/Evidencias y Documentacion/Ingenieria_Inversa_v1.8.0.docx
@@ -1673,24 +1673,100 @@
     </w:p>
     <w:p>
       <w:pPr>
-        <w:pStyle w:val="Heading2"/>
-      </w:pPr>
-      <w:r>
-        <w:rPr>
-          <w:b w:val="0"/>
-        </w:rPr>
-        <w:t>RF-TCK — Tickets</w:t>
+        <w:pStyle w:val="ListBullet"/>
+      </w:pPr>
+      <w:r>
+        <w:rPr>
+          <w:b w:val="0"/>
+        </w:rPr>
+        <w:t xml:space="preserve">RF-004f </w:t>
+      </w:r>
+      <w:r>
+        <w:rPr>
+          <w:b/>
+        </w:rPr>
+        <w:t>Cierre de sesión al cerrar el navegador (nuevo v1.8.1):</w:t>
+      </w:r>
+      <w:r>
+        <w:rPr>
+          <w:b w:val="0"/>
+        </w:rPr>
+        <w:t xml:space="preserve"> cada pestaña mantiene un heartbeat en su propia clave de </w:t>
+      </w:r>
+      <w:r>
+        <w:rPr>
+          <w:rFonts w:ascii="Consolas" w:hAnsi="Consolas"/>
+          <w:color w:val="1F3B73"/>
+        </w:rPr>
+        <w:t>localStorage</w:t>
+      </w:r>
+      <w:r>
+        <w:rPr>
+          <w:b w:val="0"/>
+        </w:rPr>
+        <w:t xml:space="preserve"> (</w:t>
+      </w:r>
+      <w:r>
+        <w:rPr>
+          <w:rFonts w:ascii="Consolas" w:hAnsi="Consolas"/>
+          <w:color w:val="1F3B73"/>
+        </w:rPr>
+        <w:t>sestel-tab-&lt;id&gt;</w:t>
+      </w:r>
+      <w:r>
+        <w:rPr>
+          <w:b w:val="0"/>
+        </w:rPr>
+        <w:t xml:space="preserve">, cada 5 s, caducidad 20 s — sin lectura-escritura compartida, por lo que no hay carreras al cerrar varias pestañas a la vez). Al arrancar la app con tokens, </w:t>
+      </w:r>
+      <w:r>
+        <w:rPr>
+          <w:b/>
+        </w:rPr>
+        <w:t>sin otras pestañas con heartbeat vigente, sin ser una recarga (`navigation.type=reload`) ni un retorno del mismo origen</w:t>
+      </w:r>
+      <w:r>
+        <w:rPr>
+          <w:b w:val="0"/>
+        </w:rPr>
+        <w:t xml:space="preserve"> (p. ej. </w:t>
+      </w:r>
+      <w:r>
+        <w:rPr>
+          <w:rFonts w:ascii="Consolas" w:hAnsi="Consolas"/>
+          <w:color w:val="1F3B73"/>
+        </w:rPr>
+        <w:t>/admin/</w:t>
+      </w:r>
+      <w:r>
+        <w:rPr>
+          <w:b w:val="0"/>
+        </w:rPr>
+        <w:t xml:space="preserve">), se asume que el navegador se cerró: se limpian los tokens locales antes de pintar la app y, en segundo plano, se rota y cierra la sesión en el servidor (refresh + logout), mostrando *"Se cerró la sesión al cerrar el navegador"*. La restauración de pestañas del navegador cuenta como cierre real; un crash (sin </w:t>
+      </w:r>
+      <w:r>
+        <w:rPr>
+          <w:rFonts w:ascii="Consolas" w:hAnsi="Consolas"/>
+          <w:color w:val="1F3B73"/>
+        </w:rPr>
+        <w:t>pagehide</w:t>
+      </w:r>
+      <w:r>
+        <w:rPr>
+          <w:b w:val="0"/>
+        </w:rPr>
+        <w:t>) queda cubierto por la caducidad del refresh (≤ 24 h) y por el "un solo login global".</w:t>
       </w:r>
     </w:p>
     <w:p>
       <w:pPr>
-        <w:pStyle w:val="ListBullet"/>
-      </w:pPr>
-      <w:r>
-        <w:rPr>
-          <w:b w:val="0"/>
-        </w:rPr>
-        <w:t>RF-005 Crear ticket (despachador/supervisor): tipo solicitud (Cliente/Técnico) → servicio → solicitud específica; título auto editable.</w:t>
+        <w:pStyle w:val="Heading2"/>
+      </w:pPr>
+      <w:r>
+        <w:rPr>
+          <w:b w:val="0"/>
+        </w:rPr>
+        <w:t>RF-TCK — Tickets</w:t>
       </w:r>
     </w:p>
     <w:p>
@@ -1701,7 +1777,7 @@
         <w:rPr>
           <w:b w:val="0"/>
         </w:rPr>
-        <w:t>RF-006 Campos: Contrato (CLIENTE) u OT (TECNICO), solo números; cliente, nodo, descripción, prioridad (Media automática al crear).</w:t>
+        <w:t>RF-005 Crear ticket (despachador/supervisor): tipo solicitud (Cliente/Técnico) → servicio → solicitud específica; título auto editable.</w:t>
       </w:r>
     </w:p>
     <w:p>
@@ -1712,7 +1788,7 @@
         <w:rPr>
           <w:b w:val="0"/>
         </w:rPr>
-        <w:t>RF-007 Duplicados: no repetir Contrato ni OT en tickets abiertos; bloquea y enlaza al INC abierto.</w:t>
+        <w:t>RF-006 Campos: Contrato (CLIENTE) u OT (TECNICO), solo números; cliente, nodo, descripción, prioridad (Media automática al crear).</w:t>
       </w:r>
     </w:p>
     <w:p>
@@ -1723,7 +1799,7 @@
         <w:rPr>
           <w:b w:val="0"/>
         </w:rPr>
-        <w:t>RF-008/009/010 Tabla con Contrato/OT separados, búsqueda, orden desplegable, filtros por rol.</w:t>
+        <w:t>RF-007 Duplicados: no repetir Contrato ni OT en tickets abiertos; bloquea y enlaza al INC abierto.</w:t>
       </w:r>
     </w:p>
     <w:p>
@@ -1734,6 +1810,17 @@
         <w:rPr>
           <w:b w:val="0"/>
         </w:rPr>
+        <w:t>RF-008/009/010 Tabla con Contrato/OT separados, búsqueda, orden desplegable, filtros por rol.</w:t>
+      </w:r>
+    </w:p>
+    <w:p>
+      <w:pPr>
+        <w:pStyle w:val="ListBullet"/>
+      </w:pPr>
+      <w:r>
+        <w:rPr>
+          <w:b w:val="0"/>
+        </w:rPr>
         <w:t xml:space="preserve">RF-011 Columna Tiempo total (creado→resuelto o al momento) en </w:t>
       </w:r>
       <w:r>
@@ -3267,16 +3354,27 @@
     </w:p>
     <w:p>
       <w:pPr>
-        <w:pStyle w:val="Heading1"/>
-      </w:pPr>
-      <w:r>
-        <w:rPr>
-          <w:b w:val="0"/>
-        </w:rPr>
-        <w:t>7. Modelo de datos (resumen)</w:t>
+        <w:pStyle w:val="ListBullet"/>
+      </w:pPr>
+      <w:r>
+        <w:rPr>
+          <w:b w:val="0"/>
+        </w:rPr>
+        <w:t>US-045 Como usuario quiero que al cerrar el navegador la sesión no quede viva en el equipo, sin que por eso se pierda al recargar la página. [RF-004f]</w:t>
       </w:r>
     </w:p>
     <w:p>
+      <w:pPr>
+        <w:pStyle w:val="Heading1"/>
+      </w:pPr>
+      <w:r>
+        <w:rPr>
+          <w:b w:val="0"/>
+        </w:rPr>
+        <w:t>7. Modelo de datos (resumen)</w:t>
+      </w:r>
+    </w:p>
+    <w:p>
       <w:r>
         <w:rPr>
           <w:rFonts w:ascii="Consolas" w:hAnsi="Consolas"/>
@@ -4340,7 +4438,31 @@
         <w:rPr>
           <w:b w:val="0"/>
         </w:rPr>
-        <w:t xml:space="preserve"> (logout/login en una pestaña se propaga a todas). Contrapartida aceptada: los tokens sobreviven al cierre del navegador (máx. 1 día por el refresh); al desplegar v1.8.0 todos los usuarios deben iniciar sesión una vez más.</w:t>
+        <w:t xml:space="preserve"> (logout/login en una pestaña se propaga a todas). </w:t>
+      </w:r>
+      <w:r>
+        <w:rPr>
+          <w:b/>
+        </w:rPr>
+        <w:t>Enmendado en v1.8.1:</w:t>
+      </w:r>
+      <w:r>
+        <w:rPr>
+          <w:b w:val="0"/>
+        </w:rPr>
+        <w:t xml:space="preserve"> los tokens ya </w:t>
+      </w:r>
+      <w:r>
+        <w:rPr>
+          <w:b/>
+        </w:rPr>
+        <w:t>no</w:t>
+      </w:r>
+      <w:r>
+        <w:rPr>
+          <w:b w:val="0"/>
+        </w:rPr>
+        <w:t xml:space="preserve"> sobreviven al cierre del navegador — el heartbeat por pestaña detecta el cierre y la sesión se cierra en el servidor al próximo arranque de la app (se conserva en F5/recargas y retornos del mismo origen; un crash queda al refresh ≤ 24 h). Contrapartida vigente: al desplegar v1.8.0/v1.8.1 todos los usuarios deben iniciar sesión una vez más.</w:t>
       </w:r>
     </w:p>
     <w:p>
@@ -4919,6 +5041,56 @@
             <w:r/>
             <w:r>
               <w:rPr>
+                <w:b w:val="0"/>
+              </w:rPr>
+              <w:t>Tag publicado</w:t>
+            </w:r>
+          </w:p>
+        </w:tc>
+      </w:tr>
+      <w:tr>
+        <w:tc>
+          <w:tcPr>
+            <w:tcW w:type="dxa" w:w="2880"/>
+          </w:tcPr>
+          <w:p>
+            <w:r/>
+            <w:r>
+              <w:rPr>
+                <w:b w:val="0"/>
+              </w:rPr>
+              <w:t>v1.8.1</w:t>
+            </w:r>
+          </w:p>
+        </w:tc>
+        <w:tc>
+          <w:tcPr>
+            <w:tcW w:type="dxa" w:w="2880"/>
+          </w:tcPr>
+          <w:p>
+            <w:r/>
+            <w:r>
+              <w:rPr>
+                <w:b/>
+              </w:rPr>
+              <w:t>Cierre de sesión al cerrar el navegador</w:t>
+            </w:r>
+            <w:r>
+              <w:rPr>
+                <w:b w:val="0"/>
+              </w:rPr>
+              <w:t xml:space="preserve"> (heartbeat por pestaña, claves individuales sin carreras; F5 y retornos del mismo origen conservan la sesión)</w:t>
+            </w:r>
+          </w:p>
+        </w:tc>
+        <w:tc>
+          <w:tcPr>
+            <w:tcW w:type="dxa" w:w="2880"/>
+          </w:tcPr>
+          <w:p>
+            <w:r/>
+            <w:r>
+              <w:rPr>
                 <w:b/>
               </w:rPr>
               <w:t>Release actual (pendiente de tag y deploy)</w:t>

</xml_diff>

<commit_message>
fix Seguridad v1.8.2: restablecimiento de contrasena sin enumerar usuarios (respuesta generica siempre + envio via Celery)
</commit_message>
<xml_diff>
--- a/Evidencias y Documentacion/Ingenieria_Inversa_v1.8.0.docx
+++ b/Evidencias y Documentacion/Ingenieria_Inversa_v1.8.0.docx
@@ -1522,7 +1522,44 @@
         <w:rPr>
           <w:b w:val="0"/>
         </w:rPr>
-        <w:t>RF-004 Mensajes de error en español; sin enumerar usuarios.</w:t>
+        <w:t xml:space="preserve">RF-004 Mensajes de error en español; sin enumerar usuarios. </w:t>
+      </w:r>
+      <w:r>
+        <w:rPr>
+          <w:b/>
+        </w:rPr>
+        <w:t>Reforzado en v1.8.2:</w:t>
+      </w:r>
+      <w:r>
+        <w:rPr>
+          <w:b w:val="0"/>
+        </w:rPr>
+        <w:t xml:space="preserve"> el restablecimiento de contraseña responde </w:t>
+      </w:r>
+      <w:r>
+        <w:rPr>
+          <w:b/>
+        </w:rPr>
+        <w:t>siempre igual</w:t>
+      </w:r>
+      <w:r>
+        <w:rPr>
+          <w:b w:val="0"/>
+        </w:rPr>
+        <w:t xml:space="preserve"> (HTTP 200, *"Si existe una cuenta con ese correo, recibirás un mensaje…"*), exista o no el correo y esté o no activa la cuenta —sin la rama "No existe una cuenta" que solo aparecía con </w:t>
+      </w:r>
+      <w:r>
+        <w:rPr>
+          <w:rFonts w:ascii="Consolas" w:hAnsi="Consolas"/>
+          <w:color w:val="1F3B73"/>
+        </w:rPr>
+        <w:t>DEBUG</w:t>
+      </w:r>
+      <w:r>
+        <w:rPr>
+          <w:b w:val="0"/>
+        </w:rPr>
+        <w:t>—, y el correo se envía en una tarea de Celery para que ni el tiempo de respuesta delate la existencia de la cuenta (respaldo síncrono solo si no hay broker).</w:t>
       </w:r>
     </w:p>
     <w:p>
@@ -5091,6 +5128,56 @@
             <w:r/>
             <w:r>
               <w:rPr>
+                <w:b w:val="0"/>
+              </w:rPr>
+              <w:t>Tag publicado</w:t>
+            </w:r>
+          </w:p>
+        </w:tc>
+      </w:tr>
+      <w:tr>
+        <w:tc>
+          <w:tcPr>
+            <w:tcW w:type="dxa" w:w="2880"/>
+          </w:tcPr>
+          <w:p>
+            <w:r/>
+            <w:r>
+              <w:rPr>
+                <w:b w:val="0"/>
+              </w:rPr>
+              <w:t>v1.8.2</w:t>
+            </w:r>
+          </w:p>
+        </w:tc>
+        <w:tc>
+          <w:tcPr>
+            <w:tcW w:type="dxa" w:w="2880"/>
+          </w:tcPr>
+          <w:p>
+            <w:r/>
+            <w:r>
+              <w:rPr>
+                <w:b/>
+              </w:rPr>
+              <w:t>Anti-enumeración en restablecimiento de contraseña</w:t>
+            </w:r>
+            <w:r>
+              <w:rPr>
+                <w:b w:val="0"/>
+              </w:rPr>
+              <w:t xml:space="preserve"> (respuesta genérica siempre; correo asíncrono vía Celery)</w:t>
+            </w:r>
+          </w:p>
+        </w:tc>
+        <w:tc>
+          <w:tcPr>
+            <w:tcW w:type="dxa" w:w="2880"/>
+          </w:tcPr>
+          <w:p>
+            <w:r/>
+            <w:r>
+              <w:rPr>
                 <w:b/>
               </w:rPr>
               <w:t>Release actual (pendiente de tag y deploy)</w:t>

</xml_diff>

<commit_message>
feat Despliegue v1.8.3: TLS (HTTPS) en server local - nginx 443 con certificado autofirmado (SAN IP fija), redirect 80->443, HSTS, SECURE_PROXY_SSL_HEADER para Django, script de certificado y runbook TLS
</commit_message>
<xml_diff>
--- a/Evidencias y Documentacion/Ingenieria_Inversa_v1.8.0.docx
+++ b/Evidencias y Documentacion/Ingenieria_Inversa_v1.8.0.docx
@@ -5178,6 +5178,82 @@
             <w:r/>
             <w:r>
               <w:rPr>
+                <w:b w:val="0"/>
+              </w:rPr>
+              <w:t>Tag publicado</w:t>
+            </w:r>
+          </w:p>
+        </w:tc>
+      </w:tr>
+      <w:tr>
+        <w:tc>
+          <w:tcPr>
+            <w:tcW w:type="dxa" w:w="2880"/>
+          </w:tcPr>
+          <w:p>
+            <w:r/>
+            <w:r>
+              <w:rPr>
+                <w:b w:val="0"/>
+              </w:rPr>
+              <w:t>v1.8.3</w:t>
+            </w:r>
+          </w:p>
+        </w:tc>
+        <w:tc>
+          <w:tcPr>
+            <w:tcW w:type="dxa" w:w="2880"/>
+          </w:tcPr>
+          <w:p>
+            <w:r/>
+            <w:r>
+              <w:rPr>
+                <w:b/>
+              </w:rPr>
+              <w:t>TLS (HTTPS) en el server local</w:t>
+            </w:r>
+            <w:r>
+              <w:rPr>
+                <w:b w:val="0"/>
+              </w:rPr>
+              <w:t xml:space="preserve"> — nginx termina TLS (443) con certificado autofirmado generado por </w:t>
+            </w:r>
+            <w:r>
+              <w:rPr>
+                <w:rFonts w:ascii="Consolas" w:hAnsi="Consolas"/>
+                <w:color w:val="1F3B73"/>
+              </w:rPr>
+              <w:t>scripts/generar_certificado.sh</w:t>
+            </w:r>
+            <w:r>
+              <w:rPr>
+                <w:b w:val="0"/>
+              </w:rPr>
+              <w:t xml:space="preserve"> (SAN con IP fija, 397 días), redirect 80→443, HSTS activo, </w:t>
+            </w:r>
+            <w:r>
+              <w:rPr>
+                <w:rFonts w:ascii="Consolas" w:hAnsi="Consolas"/>
+                <w:color w:val="1F3B73"/>
+              </w:rPr>
+              <w:t>SECURE_PROXY_SSL_HEADER</w:t>
+            </w:r>
+            <w:r>
+              <w:rPr>
+                <w:b w:val="0"/>
+              </w:rPr>
+              <w:t xml:space="preserve"> para Django; certificado de arranque automático si no hay propios</w:t>
+            </w:r>
+          </w:p>
+        </w:tc>
+        <w:tc>
+          <w:tcPr>
+            <w:tcW w:type="dxa" w:w="2880"/>
+          </w:tcPr>
+          <w:p>
+            <w:r/>
+            <w:r>
+              <w:rPr>
                 <w:b/>
               </w:rPr>
               <w:t>Release actual (pendiente de tag y deploy)</w:t>

</xml_diff>

<commit_message>
v1.8.4: alcance de datos por rol (RF-004g) - /groups/ y /teams/ acotados al grupo del usuario (admin: catalogo completo, detalle ajeno 404) - /dashboard/ solo ADMIN/SUPERVISOR/SOPORTE: DESPACHADOR recibe 403 y el front deja de pedirlo - suite 40/40 (CatalogVisibilityTests + DashboardAccessTests) - docs: RF-004g, US-046, REPORTE_7 F-28/T-21..T-23, build verde
</commit_message>
<xml_diff>
--- a/Evidencias y Documentacion/Ingenieria_Inversa_v1.8.0.docx
+++ b/Evidencias y Documentacion/Ingenieria_Inversa_v1.8.0.docx
@@ -1797,24 +1797,88 @@
     </w:p>
     <w:p>
       <w:pPr>
-        <w:pStyle w:val="Heading2"/>
-      </w:pPr>
-      <w:r>
-        <w:rPr>
-          <w:b w:val="0"/>
-        </w:rPr>
-        <w:t>RF-TCK — Tickets</w:t>
+        <w:pStyle w:val="ListBullet"/>
+      </w:pPr>
+      <w:r>
+        <w:rPr>
+          <w:b w:val="0"/>
+        </w:rPr>
+        <w:t xml:space="preserve">RF-004g </w:t>
+      </w:r>
+      <w:r>
+        <w:rPr>
+          <w:b/>
+        </w:rPr>
+        <w:t>Alcance de datos por rol (nuevo v1.8.4):</w:t>
+      </w:r>
+      <w:r>
+        <w:rPr>
+          <w:b w:val="0"/>
+        </w:rPr>
+        <w:t xml:space="preserve"> la API no sirve catálogos ni métricas globales a perfiles que no los usan en su navegación. </w:t>
+      </w:r>
+      <w:r>
+        <w:rPr>
+          <w:rFonts w:ascii="Consolas" w:hAnsi="Consolas"/>
+          <w:color w:val="1F3B73"/>
+        </w:rPr>
+        <w:t>GET /groups/</w:t>
+      </w:r>
+      <w:r>
+        <w:rPr>
+          <w:b w:val="0"/>
+        </w:rPr>
+        <w:t xml:space="preserve"> y </w:t>
+      </w:r>
+      <w:r>
+        <w:rPr>
+          <w:rFonts w:ascii="Consolas" w:hAnsi="Consolas"/>
+          <w:color w:val="1F3B73"/>
+        </w:rPr>
+        <w:t>GET /teams/</w:t>
+      </w:r>
+      <w:r>
+        <w:rPr>
+          <w:b w:val="0"/>
+        </w:rPr>
+        <w:t xml:space="preserve"> devuelven solo los grupos/equipos del usuario (</w:t>
+      </w:r>
+      <w:r>
+        <w:rPr>
+          <w:rFonts w:ascii="Consolas" w:hAnsi="Consolas"/>
+          <w:color w:val="1F3B73"/>
+        </w:rPr>
+        <w:t>group_codes</w:t>
+      </w:r>
+      <w:r>
+        <w:rPr>
+          <w:b w:val="0"/>
+        </w:rPr>
+        <w:t xml:space="preserve"> = equipos + grupos supervisados); los administradores conservan el catálogo completo y el detalle de un grupo/equipo ajeno responde 404. </w:t>
+      </w:r>
+      <w:r>
+        <w:rPr>
+          <w:rFonts w:ascii="Consolas" w:hAnsi="Consolas"/>
+          <w:color w:val="1F3B73"/>
+        </w:rPr>
+        <w:t>GET /dashboard/</w:t>
+      </w:r>
+      <w:r>
+        <w:rPr>
+          <w:b w:val="0"/>
+        </w:rPr>
+        <w:t xml:space="preserve"> pertenece a ADMIN, SUPERVISOR y SOPORTE (los roles con vista "Resumen"): el DESPACHADOR recibe 403 *"Tu perfil no tiene acceso al panel de resumen"* y el front deja de solicitarlo. Tickets, usuarios, áreas de escalamiento y tipos de solicitud mantienen su alcance previo (visibilidad por grupo / catálogos operativos).</w:t>
       </w:r>
     </w:p>
     <w:p>
       <w:pPr>
-        <w:pStyle w:val="ListBullet"/>
-      </w:pPr>
-      <w:r>
-        <w:rPr>
-          <w:b w:val="0"/>
-        </w:rPr>
-        <w:t>RF-005 Crear ticket (despachador/supervisor): tipo solicitud (Cliente/Técnico) → servicio → solicitud específica; título auto editable.</w:t>
+        <w:pStyle w:val="Heading2"/>
+      </w:pPr>
+      <w:r>
+        <w:rPr>
+          <w:b w:val="0"/>
+        </w:rPr>
+        <w:t>RF-TCK — Tickets</w:t>
       </w:r>
     </w:p>
     <w:p>
@@ -1825,7 +1889,7 @@
         <w:rPr>
           <w:b w:val="0"/>
         </w:rPr>
-        <w:t>RF-006 Campos: Contrato (CLIENTE) u OT (TECNICO), solo números; cliente, nodo, descripción, prioridad (Media automática al crear).</w:t>
+        <w:t>RF-005 Crear ticket (despachador/supervisor): tipo solicitud (Cliente/Técnico) → servicio → solicitud específica; título auto editable.</w:t>
       </w:r>
     </w:p>
     <w:p>
@@ -1836,7 +1900,7 @@
         <w:rPr>
           <w:b w:val="0"/>
         </w:rPr>
-        <w:t>RF-007 Duplicados: no repetir Contrato ni OT en tickets abiertos; bloquea y enlaza al INC abierto.</w:t>
+        <w:t>RF-006 Campos: Contrato (CLIENTE) u OT (TECNICO), solo números; cliente, nodo, descripción, prioridad (Media automática al crear).</w:t>
       </w:r>
     </w:p>
     <w:p>
@@ -1847,7 +1911,7 @@
         <w:rPr>
           <w:b w:val="0"/>
         </w:rPr>
-        <w:t>RF-008/009/010 Tabla con Contrato/OT separados, búsqueda, orden desplegable, filtros por rol.</w:t>
+        <w:t>RF-007 Duplicados: no repetir Contrato ni OT en tickets abiertos; bloquea y enlaza al INC abierto.</w:t>
       </w:r>
     </w:p>
     <w:p>
@@ -1858,6 +1922,17 @@
         <w:rPr>
           <w:b w:val="0"/>
         </w:rPr>
+        <w:t>RF-008/009/010 Tabla con Contrato/OT separados, búsqueda, orden desplegable, filtros por rol.</w:t>
+      </w:r>
+    </w:p>
+    <w:p>
+      <w:pPr>
+        <w:pStyle w:val="ListBullet"/>
+      </w:pPr>
+      <w:r>
+        <w:rPr>
+          <w:b w:val="0"/>
+        </w:rPr>
         <w:t xml:space="preserve">RF-011 Columna Tiempo total (creado→resuelto o al momento) en </w:t>
       </w:r>
       <w:r>
@@ -3398,6 +3473,17 @@
           <w:b w:val="0"/>
         </w:rPr>
         <w:t>US-045 Como usuario quiero que al cerrar el navegador la sesión no quede viva en el equipo, sin que por eso se pierda al recargar la página. [RF-004f]</w:t>
+      </w:r>
+    </w:p>
+    <w:p>
+      <w:pPr>
+        <w:pStyle w:val="ListBullet"/>
+      </w:pPr>
+      <w:r>
+        <w:rPr>
+          <w:b w:val="0"/>
+        </w:rPr>
+        <w:t>US-046 Como administrador quiero que cada rol solo reciba los datos que su pantalla utiliza, para que un perfil de despacho no pueda consultar catálogos de otros grupos ni el panel de resumen vía API. [RF-004g]</w:t>
       </w:r>
     </w:p>
     <w:p>
@@ -5254,9 +5340,98 @@
             <w:r/>
             <w:r>
               <w:rPr>
+                <w:b w:val="0"/>
+              </w:rPr>
+              <w:t>Tag publicado (pendiente de deploy)</w:t>
+            </w:r>
+          </w:p>
+        </w:tc>
+      </w:tr>
+      <w:tr>
+        <w:tc>
+          <w:tcPr>
+            <w:tcW w:type="dxa" w:w="2880"/>
+          </w:tcPr>
+          <w:p>
+            <w:r/>
+            <w:r>
+              <w:rPr>
+                <w:b w:val="0"/>
+              </w:rPr>
+              <w:t>v1.8.4</w:t>
+            </w:r>
+          </w:p>
+        </w:tc>
+        <w:tc>
+          <w:tcPr>
+            <w:tcW w:type="dxa" w:w="2880"/>
+          </w:tcPr>
+          <w:p>
+            <w:r/>
+            <w:r>
+              <w:rPr>
                 <w:b/>
               </w:rPr>
-              <w:t>Release actual (pendiente de tag y deploy)</w:t>
+              <w:t>Alcance de datos por rol (RF-004g)</w:t>
+            </w:r>
+            <w:r>
+              <w:rPr>
+                <w:b w:val="0"/>
+              </w:rPr>
+              <w:t xml:space="preserve"> — </w:t>
+            </w:r>
+            <w:r>
+              <w:rPr>
+                <w:rFonts w:ascii="Consolas" w:hAnsi="Consolas"/>
+                <w:color w:val="1F3B73"/>
+              </w:rPr>
+              <w:t>/groups/</w:t>
+            </w:r>
+            <w:r>
+              <w:rPr>
+                <w:b w:val="0"/>
+              </w:rPr>
+              <w:t xml:space="preserve"> y </w:t>
+            </w:r>
+            <w:r>
+              <w:rPr>
+                <w:rFonts w:ascii="Consolas" w:hAnsi="Consolas"/>
+                <w:color w:val="1F3B73"/>
+              </w:rPr>
+              <w:t>/teams/</w:t>
+            </w:r>
+            <w:r>
+              <w:rPr>
+                <w:b w:val="0"/>
+              </w:rPr>
+              <w:t xml:space="preserve"> acotados a los grupos del usuario (admin: catálogo completo; detalle ajeno: 404); </w:t>
+            </w:r>
+            <w:r>
+              <w:rPr>
+                <w:rFonts w:ascii="Consolas" w:hAnsi="Consolas"/>
+                <w:color w:val="1F3B73"/>
+              </w:rPr>
+              <w:t>/dashboard/</w:t>
+            </w:r>
+            <w:r>
+              <w:rPr>
+                <w:b w:val="0"/>
+              </w:rPr>
+              <w:t xml:space="preserve"> solo para ADMIN/SUPERVISOR/SOPORTE (DESPACHADOR: 403) y el front deja de pedirlo</w:t>
+            </w:r>
+          </w:p>
+        </w:tc>
+        <w:tc>
+          <w:tcPr>
+            <w:tcW w:type="dxa" w:w="2880"/>
+          </w:tcPr>
+          <w:p>
+            <w:r/>
+            <w:r>
+              <w:rPr>
+                <w:b/>
+              </w:rPr>
+              <w:t>Release actual</w:t>
             </w:r>
           </w:p>
         </w:tc>
@@ -5407,6 +5582,18 @@
           <w:b w:val="0"/>
         </w:rPr>
         <w:t xml:space="preserve"> en v1.8.0 (Django 5.2.18, verificado en Docker y Python local); </w:t>
+      </w:r>
+      <w:r>
+        <w:rPr>
+          <w:b/>
+        </w:rPr>
+        <w:t>40/40 OK en v1.8.4</w:t>
+      </w:r>
+      <w:r>
+        <w:rPr>
+          <w:b w:val="0"/>
+        </w:rPr>
+        <w:t xml:space="preserve"> (RF-004g incluida); </w:t>
       </w:r>
       <w:r>
         <w:rPr>

</xml_diff>

<commit_message>
docs: API principal consistente con RF-004g - teams/groups lectura acotada, dashboard solo ADMIN/SUPERVISOR/SOPORTE, users listado acotado; docx regenerado
</commit_message>
<xml_diff>
--- a/Evidencias y Documentacion/Ingenieria_Inversa_v1.8.0.docx
+++ b/Evidencias y Documentacion/Ingenieria_Inversa_v1.8.0.docx
@@ -3943,7 +3943,7 @@
         <w:rPr>
           <w:b w:val="0"/>
         </w:rPr>
-        <w:t xml:space="preserve"> (crear solo ADMIN) · </w:t>
+        <w:t xml:space="preserve"> (crear solo ADMIN; listado acotado por rol) · </w:t>
       </w:r>
       <w:r>
         <w:rPr>
@@ -4007,26 +4007,50 @@
         <w:rPr>
           <w:b w:val="0"/>
         </w:rPr>
+        <w:t xml:space="preserve"> (</w:t>
+      </w:r>
+      <w:r>
+        <w:rPr>
+          <w:b/>
+        </w:rPr>
+        <w:t>lectura de `teams`/`groups` acotada a los grupos del usuario; escritura solo ADMIN</w:t>
+      </w:r>
+      <w:r>
+        <w:rPr>
+          <w:b w:val="0"/>
+        </w:rPr>
+        <w:t xml:space="preserve">, RF-004g) · </w:t>
+      </w:r>
+      <w:r>
+        <w:rPr>
+          <w:b/>
+        </w:rPr>
+        <w:t>`GET/PATCH /api/ia-config/` (solo admin)</w:t>
+      </w:r>
+      <w:r>
+        <w:rPr>
+          <w:b w:val="0"/>
+        </w:rPr>
         <w:t xml:space="preserve"> · </w:t>
       </w:r>
       <w:r>
         <w:rPr>
           <w:b/>
         </w:rPr>
-        <w:t>`GET/PATCH /api/ia-config/` (solo admin)</w:t>
-      </w:r>
-      <w:r>
-        <w:rPr>
-          <w:b w:val="0"/>
-        </w:rPr>
-        <w:t xml:space="preserve"> · </w:t>
+        <w:t>`GET /api/dashboard/` (solo ADMIN/SUPERVISOR/SOPORTE; DESPACHADOR recibe 403</w:t>
+      </w:r>
+      <w:r>
+        <w:rPr>
+          <w:b w:val="0"/>
+        </w:rPr>
+        <w:t xml:space="preserve">, RF-004g) · </w:t>
       </w:r>
       <w:r>
         <w:rPr>
           <w:rFonts w:ascii="Consolas" w:hAnsi="Consolas"/>
           <w:color w:val="1F3B73"/>
         </w:rPr>
-        <w:t>GET /api/dashboard|reports/summary|reports/export</w:t>
+        <w:t>GET /api/reports/summary|reports/export</w:t>
       </w:r>
       <w:r>
         <w:rPr>

</xml_diff>

<commit_message>
v1.8.5: bandeja ordenada por prioridad por defecto - sort inicial 'prioridad' en TicketsView (antes 'recientes'); selector conserva recientes/antiguos - docs: RF-008/009/010 marca orden por defecto; RF-039/040/US-039 delimina modos de la IA (automatico o sugerencia, configurable) - REPORTE_7 v1.8.5 con fila T-24 - docx regenerado, build verde
</commit_message>
<xml_diff>
--- a/Evidencias y Documentacion/Ingenieria_Inversa_v1.8.0.docx
+++ b/Evidencias y Documentacion/Ingenieria_Inversa_v1.8.0.docx
@@ -245,7 +245,7 @@
         <w:rPr>
           <w:b/>
         </w:rPr>
-        <w:t>agente IA de prioridad (apagado por defecto, configurable por admin)</w:t>
+        <w:t>agente IA de prioridad (apagado por defecto; modo automático o solo sugerencia, configurable por admin)</w:t>
       </w:r>
       <w:r>
         <w:rPr>
@@ -1922,7 +1922,19 @@
         <w:rPr>
           <w:b w:val="0"/>
         </w:rPr>
-        <w:t>RF-008/009/010 Tabla con Contrato/OT separados, búsqueda, orden desplegable, filtros por rol.</w:t>
+        <w:t>RF-008/009/010 Tabla con Contrato/OT separados, búsqueda, orden desplegable (</w:t>
+      </w:r>
+      <w:r>
+        <w:rPr>
+          <w:b/>
+        </w:rPr>
+        <w:t>defecto: prioridad</w:t>
+      </w:r>
+      <w:r>
+        <w:rPr>
+          <w:b w:val="0"/>
+        </w:rPr>
+        <w:t xml:space="preserve"> — Crítica→Alta→Media→Baja, a igual prioridad las más antiguas; desde v1.8.5), filtros por rol.</w:t>
       </w:r>
     </w:p>
     <w:p>
@@ -2495,13 +2507,13 @@
         <w:rPr>
           <w:b/>
         </w:rPr>
-        <w:t>Interruptor maestro doble:</w:t>
-      </w:r>
-      <w:r>
-        <w:rPr>
-          <w:b w:val="0"/>
-        </w:rPr>
-        <w:t xml:space="preserve"> env </w:t>
+        <w:t>Modos de operación configurables:</w:t>
+      </w:r>
+      <w:r>
+        <w:rPr>
+          <w:b w:val="0"/>
+        </w:rPr>
+        <w:t xml:space="preserve"> interruptor maestro doble (</w:t>
       </w:r>
       <w:r>
         <w:rPr>
@@ -2514,7 +2526,7 @@
         <w:rPr>
           <w:b w:val="0"/>
         </w:rPr>
-        <w:t xml:space="preserve"> + registro </w:t>
+        <w:t xml:space="preserve"> env + registro </w:t>
       </w:r>
       <w:r>
         <w:rPr>
@@ -2527,7 +2539,7 @@
         <w:rPr>
           <w:b w:val="0"/>
         </w:rPr>
-        <w:t xml:space="preserve"> (ambos en </w:t>
+        <w:t xml:space="preserve">, ambos en </w:t>
       </w:r>
       <w:r>
         <w:rPr>
@@ -2540,20 +2552,45 @@
         <w:rPr>
           <w:b w:val="0"/>
         </w:rPr>
-        <w:t xml:space="preserve"> por defecto); </w:t>
+        <w:t xml:space="preserve"> al arrancar). Una vez encendido, el modo lo elige el admin: </w:t>
       </w:r>
       <w:r>
         <w:rPr>
           <w:rFonts w:ascii="Consolas" w:hAnsi="Consolas"/>
           <w:color w:val="1F3B73"/>
         </w:rPr>
-        <w:t>IA_AUTO_APPLY=False</w:t>
-      </w:r>
-      <w:r>
-        <w:rPr>
-          <w:b w:val="0"/>
-        </w:rPr>
-        <w:t xml:space="preserve"> = solo sugiere, nunca cambia prioridad.</w:t>
+        <w:t>auto_apply=True</w:t>
+      </w:r>
+      <w:r>
+        <w:rPr>
+          <w:b w:val="0"/>
+        </w:rPr>
+        <w:t xml:space="preserve"> → </w:t>
+      </w:r>
+      <w:r>
+        <w:rPr>
+          <w:b/>
+        </w:rPr>
+        <w:t>la IA aplica sola</w:t>
+      </w:r>
+      <w:r>
+        <w:rPr>
+          <w:b w:val="0"/>
+        </w:rPr>
+        <w:t xml:space="preserve"> los cambios que superan el umbral (sin autorización humana por ticket, con los frenos de abajo); </w:t>
+      </w:r>
+      <w:r>
+        <w:rPr>
+          <w:rFonts w:ascii="Consolas" w:hAnsi="Consolas"/>
+          <w:color w:val="1F3B73"/>
+        </w:rPr>
+        <w:t>auto_apply=False</w:t>
+      </w:r>
+      <w:r>
+        <w:rPr>
+          <w:b w:val="0"/>
+        </w:rPr>
+        <w:t xml:space="preserve"> → solo sugiere y el cambio lo decide una persona.</w:t>
       </w:r>
     </w:p>
     <w:p>
@@ -2576,19 +2613,44 @@
         <w:rPr>
           <w:b w:val="0"/>
         </w:rPr>
-        <w:t xml:space="preserve"> (solo ADMIN): activar/desactivar, cambio automático on/off, umbral de confianza 50–95% (default 80%), servicios donde actúa (default FTTH+HFC), permitir bajar prioridad y </w:t>
+        <w:t xml:space="preserve"> (solo ADMIN): activar/desactivar, </w:t>
       </w:r>
       <w:r>
         <w:rPr>
           <w:b/>
         </w:rPr>
+        <w:t>cambio automático on/off (por defecto off en el arranque; on = la IA escribe sola sin autorización por ticket)</w:t>
+      </w:r>
+      <w:r>
+        <w:rPr>
+          <w:b w:val="0"/>
+        </w:rPr>
+        <w:t xml:space="preserve">, umbral de confianza 50–95% (default 80%), servicios donde actúa (default FTTH+HFC), permitir bajar prioridad y </w:t>
+      </w:r>
+      <w:r>
+        <w:rPr>
+          <w:b/>
+        </w:rPr>
         <w:t>"Horas mínimas entre cambios de la IA en el mismo ticket"</w:t>
       </w:r>
       <w:r>
         <w:rPr>
           <w:b w:val="0"/>
         </w:rPr>
-        <w:t xml:space="preserve"> (cooldown anti-rebote, default 24 h; no confundir con el SLA, que se recalcula en cada cambio de prioridad).</w:t>
+        <w:t xml:space="preserve"> (cooldown anti-rebote, default 24 h; no confundir con el SLA, que se recalcula en cada cambio de prioridad). El orden de frenos al aplicar: agente encendido → ticket no cerrado → servicio en alcance → cooldown vigente → confianza ≥ umbral → </w:t>
+      </w:r>
+      <w:r>
+        <w:rPr>
+          <w:rFonts w:ascii="Consolas" w:hAnsi="Consolas"/>
+          <w:color w:val="1F3B73"/>
+        </w:rPr>
+        <w:t>allow_lower</w:t>
+      </w:r>
+      <w:r>
+        <w:rPr>
+          <w:b w:val="0"/>
+        </w:rPr>
+        <w:t xml:space="preserve"> si baja prioridad.</w:t>
       </w:r>
     </w:p>
     <w:p>
@@ -3406,7 +3468,19 @@
         <w:rPr>
           <w:b w:val="0"/>
         </w:rPr>
-        <w:t>US-039 Como admin quiero que la IA solo sugiera (no aplique) y con umbral configurable para mantener el criterio humano. [RF-039/041]</w:t>
+        <w:t xml:space="preserve">US-039 Como admin quiero decidir si la IA </w:t>
+      </w:r>
+      <w:r>
+        <w:rPr>
+          <w:b/>
+        </w:rPr>
+        <w:t>aplica los cambios sola</w:t>
+      </w:r>
+      <w:r>
+        <w:rPr>
+          <w:b w:val="0"/>
+        </w:rPr>
+        <w:t xml:space="preserve"> (con umbral y frenos configurables) o si solo sugiere y decide el humano. [RF-039/041]</w:t>
       </w:r>
     </w:p>
     <w:p>
@@ -5453,6 +5527,68 @@
             <w:r/>
             <w:r>
               <w:rPr>
+                <w:b w:val="0"/>
+              </w:rPr>
+              <w:t>Tag publicado</w:t>
+            </w:r>
+          </w:p>
+        </w:tc>
+      </w:tr>
+      <w:tr>
+        <w:tc>
+          <w:tcPr>
+            <w:tcW w:type="dxa" w:w="2880"/>
+          </w:tcPr>
+          <w:p>
+            <w:r/>
+            <w:r>
+              <w:rPr>
+                <w:b w:val="0"/>
+              </w:rPr>
+              <w:t>v1.8.5</w:t>
+            </w:r>
+          </w:p>
+        </w:tc>
+        <w:tc>
+          <w:tcPr>
+            <w:tcW w:type="dxa" w:w="2880"/>
+          </w:tcPr>
+          <w:p>
+            <w:r/>
+            <w:r>
+              <w:rPr>
+                <w:b/>
+              </w:rPr>
+              <w:t>Bandeja ordenada por prioridad por defecto</w:t>
+            </w:r>
+            <w:r>
+              <w:rPr>
+                <w:b w:val="0"/>
+              </w:rPr>
+              <w:t xml:space="preserve"> (antes "recientes"; el selector conserva recientes/antiguos) + ingeniería inversa delimina los modos de la IA: </w:t>
+            </w:r>
+            <w:r>
+              <w:rPr>
+                <w:b/>
+              </w:rPr>
+              <w:t>cambio automático posible y configurable</w:t>
+            </w:r>
+            <w:r>
+              <w:rPr>
+                <w:b w:val="0"/>
+              </w:rPr>
+              <w:t xml:space="preserve"> (apagado en el arranque, con frenos: umbral, servicios, allow_lower, cooldown 24 h)</w:t>
+            </w:r>
+          </w:p>
+        </w:tc>
+        <w:tc>
+          <w:tcPr>
+            <w:tcW w:type="dxa" w:w="2880"/>
+          </w:tcPr>
+          <w:p>
+            <w:r/>
+            <w:r>
+              <w:rPr>
                 <w:b/>
               </w:rPr>
               <w:t>Release actual</w:t>

</xml_diff>

<commit_message>
v1.8.6 (docs): ingenieria inversa y REPORTE_7 reflejan orden estado+prioridad con cerrados al fondo
</commit_message>
<xml_diff>
--- a/Evidencias y Documentacion/Ingenieria_Inversa_v1.8.0.docx
+++ b/Evidencias y Documentacion/Ingenieria_Inversa_v1.8.0.docx
@@ -1928,13 +1928,13 @@
         <w:rPr>
           <w:b/>
         </w:rPr>
-        <w:t>defecto: prioridad</w:t>
-      </w:r>
-      <w:r>
-        <w:rPr>
-          <w:b w:val="0"/>
-        </w:rPr>
-        <w:t xml:space="preserve"> — Crítica→Alta→Media→Baja, a igual prioridad las más antiguas; desde v1.8.5), filtros por rol.</w:t>
+        <w:t>defecto: estado + prioridad</w:t>
+      </w:r>
+      <w:r>
+        <w:rPr>
+          <w:b w:val="0"/>
+        </w:rPr>
+        <w:t xml:space="preserve"> — los tickets cerrados van siempre al fondo; dentro de cada estado, prioridad Crítica→Alta→Media→Baja y a igual prioridad las más antiguas; desde v1.8.5 y regla de cerrados desde v1.8.6), filtros por rol.</w:t>
       </w:r>
     </w:p>
     <w:p>
@@ -5589,6 +5589,56 @@
             <w:r/>
             <w:r>
               <w:rPr>
+                <w:b w:val="0"/>
+              </w:rPr>
+              <w:t>Tag publicado</w:t>
+            </w:r>
+          </w:p>
+        </w:tc>
+      </w:tr>
+      <w:tr>
+        <w:tc>
+          <w:tcPr>
+            <w:tcW w:type="dxa" w:w="2880"/>
+          </w:tcPr>
+          <w:p>
+            <w:r/>
+            <w:r>
+              <w:rPr>
+                <w:b w:val="0"/>
+              </w:rPr>
+              <w:t>v1.8.6</w:t>
+            </w:r>
+          </w:p>
+        </w:tc>
+        <w:tc>
+          <w:tcPr>
+            <w:tcW w:type="dxa" w:w="2880"/>
+          </w:tcPr>
+          <w:p>
+            <w:r/>
+            <w:r>
+              <w:rPr>
+                <w:b/>
+              </w:rPr>
+              <w:t>Orden de la bandeja por estado + prioridad</w:t>
+            </w:r>
+            <w:r>
+              <w:rPr>
+                <w:b w:val="0"/>
+              </w:rPr>
+              <w:t xml:space="preserve"> — cerrados siempre al fondo y, dentro de cada estado, prioridad (Crítica→Alta→Media→Baja); selector renombrado a "estado + prioridad" (solo frontend)</w:t>
+            </w:r>
+          </w:p>
+        </w:tc>
+        <w:tc>
+          <w:tcPr>
+            <w:tcW w:type="dxa" w:w="2880"/>
+          </w:tcPr>
+          <w:p>
+            <w:r/>
+            <w:r>
+              <w:rPr>
                 <w:b/>
               </w:rPr>
               <w:t>Release actual</w:t>

</xml_diff>

<commit_message>
v1.8.7: Ollama como servicio del stack de produccion (compose.prod + runbook §6)
</commit_message>
<xml_diff>
--- a/Evidencias y Documentacion/Ingenieria_Inversa_v1.8.0.docx
+++ b/Evidencias y Documentacion/Ingenieria_Inversa_v1.8.0.docx
@@ -1031,7 +1031,20 @@
               <w:rPr>
                 <w:b w:val="0"/>
               </w:rPr>
-              <w:t>)</w:t>
+              <w:t xml:space="preserve">); en prod corre como servicio del stack (compose </w:t>
+            </w:r>
+            <w:r>
+              <w:rPr>
+                <w:rFonts w:ascii="Consolas" w:hAnsi="Consolas"/>
+                <w:color w:val="1F3B73"/>
+              </w:rPr>
+              <w:t>ollama</w:t>
+            </w:r>
+            <w:r>
+              <w:rPr>
+                <w:b w:val="0"/>
+              </w:rPr>
+              <w:t>, volumen de modelos, sin puerto público — Runbook §6)</w:t>
             </w:r>
           </w:p>
         </w:tc>
@@ -2919,7 +2932,33 @@
         <w:rPr>
           <w:b w:val="0"/>
         </w:rPr>
-        <w:t>; opcional y apagada por defecto — el sistema funciona completo sin ella.</w:t>
+        <w:t xml:space="preserve">; opcional y apagada por defecto — el sistema funciona completo sin ella. En prod corre como servicio del stack (imagen </w:t>
+      </w:r>
+      <w:r>
+        <w:rPr>
+          <w:rFonts w:ascii="Consolas" w:hAnsi="Consolas"/>
+          <w:color w:val="1F3B73"/>
+        </w:rPr>
+        <w:t>ollama/ollama</w:t>
+      </w:r>
+      <w:r>
+        <w:rPr>
+          <w:b w:val="0"/>
+        </w:rPr>
+        <w:t xml:space="preserve">, pesos en el volumen </w:t>
+      </w:r>
+      <w:r>
+        <w:rPr>
+          <w:rFonts w:ascii="Consolas" w:hAnsi="Consolas"/>
+          <w:color w:val="1F3B73"/>
+        </w:rPr>
+        <w:t>ollama_models</w:t>
+      </w:r>
+      <w:r>
+        <w:rPr>
+          <w:b w:val="0"/>
+        </w:rPr>
+        <w:t>, puerto no publicado).</w:t>
       </w:r>
     </w:p>
     <w:p>
@@ -3101,7 +3140,7 @@
         <w:rPr>
           <w:b w:val="0"/>
         </w:rPr>
-        <w:t xml:space="preserve"> (ver Runbook §5).</w:t>
+        <w:t xml:space="preserve"> (ver Runbook §7).</w:t>
       </w:r>
     </w:p>
     <w:p>
@@ -4548,7 +4587,7 @@
         <w:rPr>
           <w:b w:val="0"/>
         </w:rPr>
-        <w:t xml:space="preserve"> en vez de EC2: sin costos de nube ni exposición a internet; contrapartida — backups internos obligatorios y sin redundancia (Runbook §11).</w:t>
+        <w:t xml:space="preserve"> en vez de EC2: sin costos de nube ni exposición a internet; contrapartida — backups internos obligatorios y sin redundancia (Runbook §13).</w:t>
       </w:r>
     </w:p>
     <w:p>
@@ -5639,6 +5678,134 @@
             <w:r/>
             <w:r>
               <w:rPr>
+                <w:b w:val="0"/>
+              </w:rPr>
+              <w:t>Tag publicado</w:t>
+            </w:r>
+          </w:p>
+        </w:tc>
+      </w:tr>
+      <w:tr>
+        <w:tc>
+          <w:tcPr>
+            <w:tcW w:type="dxa" w:w="2880"/>
+          </w:tcPr>
+          <w:p>
+            <w:r/>
+            <w:r>
+              <w:rPr>
+                <w:b w:val="0"/>
+              </w:rPr>
+              <w:t>v1.8.7</w:t>
+            </w:r>
+          </w:p>
+        </w:tc>
+        <w:tc>
+          <w:tcPr>
+            <w:tcW w:type="dxa" w:w="2880"/>
+          </w:tcPr>
+          <w:p>
+            <w:r/>
+            <w:r>
+              <w:rPr>
+                <w:b/>
+              </w:rPr>
+              <w:t>Ollama como servicio en prod</w:t>
+            </w:r>
+            <w:r>
+              <w:rPr>
+                <w:b w:val="0"/>
+              </w:rPr>
+              <w:t xml:space="preserve"> — servicio </w:t>
+            </w:r>
+            <w:r>
+              <w:rPr>
+                <w:rFonts w:ascii="Consolas" w:hAnsi="Consolas"/>
+                <w:color w:val="1F3B73"/>
+              </w:rPr>
+              <w:t>ollama</w:t>
+            </w:r>
+            <w:r>
+              <w:rPr>
+                <w:b w:val="0"/>
+              </w:rPr>
+              <w:t xml:space="preserve"> en </w:t>
+            </w:r>
+            <w:r>
+              <w:rPr>
+                <w:rFonts w:ascii="Consolas" w:hAnsi="Consolas"/>
+                <w:color w:val="1F3B73"/>
+              </w:rPr>
+              <w:t>compose.prod.yaml</w:t>
+            </w:r>
+            <w:r>
+              <w:rPr>
+                <w:b w:val="0"/>
+              </w:rPr>
+              <w:t xml:space="preserve"> (volumen </w:t>
+            </w:r>
+            <w:r>
+              <w:rPr>
+                <w:rFonts w:ascii="Consolas" w:hAnsi="Consolas"/>
+                <w:color w:val="1F3B73"/>
+              </w:rPr>
+              <w:t>ollama_models</w:t>
+            </w:r>
+            <w:r>
+              <w:rPr>
+                <w:b w:val="0"/>
+              </w:rPr>
+              <w:t xml:space="preserve">, puerto 11434 no publicado; </w:t>
+            </w:r>
+            <w:r>
+              <w:rPr>
+                <w:rFonts w:ascii="Consolas" w:hAnsi="Consolas"/>
+                <w:color w:val="1F3B73"/>
+              </w:rPr>
+              <w:t>api</w:t>
+            </w:r>
+            <w:r>
+              <w:rPr>
+                <w:b w:val="0"/>
+              </w:rPr>
+              <w:t>/</w:t>
+            </w:r>
+            <w:r>
+              <w:rPr>
+                <w:rFonts w:ascii="Consolas" w:hAnsi="Consolas"/>
+                <w:color w:val="1F3B73"/>
+              </w:rPr>
+              <w:t>worker</w:t>
+            </w:r>
+            <w:r>
+              <w:rPr>
+                <w:b w:val="0"/>
+              </w:rPr>
+              <w:t xml:space="preserve"> lo alcanzan por red interna), env de IA parametrizado por </w:t>
+            </w:r>
+            <w:r>
+              <w:rPr>
+                <w:rFonts w:ascii="Consolas" w:hAnsi="Consolas"/>
+                <w:color w:val="1F3B73"/>
+              </w:rPr>
+              <w:t>.env</w:t>
+            </w:r>
+            <w:r>
+              <w:rPr>
+                <w:b w:val="0"/>
+              </w:rPr>
+              <w:t xml:space="preserve"> y Runbook §6 con la descarga de modelos y la activación por doble interruptor</w:t>
+            </w:r>
+          </w:p>
+        </w:tc>
+        <w:tc>
+          <w:tcPr>
+            <w:tcW w:type="dxa" w:w="2880"/>
+          </w:tcPr>
+          <w:p>
+            <w:r/>
+            <w:r>
+              <w:rPr>
                 <w:b/>
               </w:rPr>
               <w:t>Release actual</w:t>
@@ -5718,7 +5885,7 @@
         <w:rPr>
           <w:b w:val="0"/>
         </w:rPr>
-        <w:t>, arranque auto, cron SLA, backups, firewall, releases).</w:t>
+        <w:t>, TLS, IA/Ollama, arranque auto, cron SLA, backups, firewall, releases).</w:t>
       </w:r>
     </w:p>
     <w:p>

</xml_diff>

<commit_message>
v1.8.8: agente IA ~3x mas rapido (think:false + espera 60->20s + keep_alive 30m)
</commit_message>
<xml_diff>
--- a/Evidencias y Documentacion/Ingenieria_Inversa_v1.8.0.docx
+++ b/Evidencias y Documentacion/Ingenieria_Inversa_v1.8.0.docx
@@ -5806,6 +5806,94 @@
             <w:r/>
             <w:r>
               <w:rPr>
+                <w:b w:val="0"/>
+              </w:rPr>
+              <w:t>Tag publicado</w:t>
+            </w:r>
+          </w:p>
+        </w:tc>
+      </w:tr>
+      <w:tr>
+        <w:tc>
+          <w:tcPr>
+            <w:tcW w:type="dxa" w:w="2880"/>
+          </w:tcPr>
+          <w:p>
+            <w:r/>
+            <w:r>
+              <w:rPr>
+                <w:b w:val="0"/>
+              </w:rPr>
+              <w:t>v1.8.8</w:t>
+            </w:r>
+          </w:p>
+        </w:tc>
+        <w:tc>
+          <w:tcPr>
+            <w:tcW w:type="dxa" w:w="2880"/>
+          </w:tcPr>
+          <w:p>
+            <w:r/>
+            <w:r>
+              <w:rPr>
+                <w:b/>
+              </w:rPr>
+              <w:t>Agente IA ~3× más rápido (medido con imagen y prompts reales)</w:t>
+            </w:r>
+            <w:r>
+              <w:rPr>
+                <w:b w:val="0"/>
+              </w:rPr>
+              <w:t xml:space="preserve"> — revisor con </w:t>
+            </w:r>
+            <w:r>
+              <w:rPr>
+                <w:rFonts w:ascii="Consolas" w:hAnsi="Consolas"/>
+                <w:color w:val="1F3B73"/>
+              </w:rPr>
+              <w:t>think:false</w:t>
+            </w:r>
+            <w:r>
+              <w:rPr>
+                <w:b w:val="0"/>
+              </w:rPr>
+              <w:t xml:space="preserve"> (qwen3:4b directo al JSON: 54 s → 7 s), espera entre etapas 60→20 s y </w:t>
+            </w:r>
+            <w:r>
+              <w:rPr>
+                <w:rFonts w:ascii="Consolas" w:hAnsi="Consolas"/>
+                <w:color w:val="1F3B73"/>
+              </w:rPr>
+              <w:t>OLLAMA_KEEP_ALIVE=30m</w:t>
+            </w:r>
+            <w:r>
+              <w:rPr>
+                <w:b w:val="0"/>
+              </w:rPr>
+              <w:t xml:space="preserve"> en el servicio Ollama; análisis completo ~2 min → </w:t>
+            </w:r>
+            <w:r>
+              <w:rPr>
+                <w:b/>
+              </w:rPr>
+              <w:t>~40-60 s</w:t>
+            </w:r>
+            <w:r>
+              <w:rPr>
+                <w:b w:val="0"/>
+              </w:rPr>
+              <w:t>. moondream descartado como alternativa (más lento y salida vacía en CPU)</w:t>
+            </w:r>
+          </w:p>
+        </w:tc>
+        <w:tc>
+          <w:tcPr>
+            <w:tcW w:type="dxa" w:w="2880"/>
+          </w:tcPr>
+          <w:p>
+            <w:r/>
+            <w:r>
+              <w:rPr>
                 <w:b/>
               </w:rPr>
               <w:t>Release actual</w:t>

</xml_diff>

<commit_message>
v1.8.9: bandeja paginada (25 por pagina) y ventana de 30 dias en el listado (RF-043)
</commit_message>
<xml_diff>
--- a/Evidencias y Documentacion/Ingenieria_Inversa_v1.8.0.docx
+++ b/Evidencias y Documentacion/Ingenieria_Inversa_v1.8.0.docx
@@ -1958,20 +1958,80 @@
         <w:rPr>
           <w:b w:val="0"/>
         </w:rPr>
-        <w:t xml:space="preserve">RF-011 Columna Tiempo total (creado→resuelto o al momento) en </w:t>
+        <w:t xml:space="preserve">RF-043 </w:t>
+      </w:r>
+      <w:r>
+        <w:rPr>
+          <w:b/>
+        </w:rPr>
+        <w:t>Bandeja paginada y acotada (nuevo v1.8.9):</w:t>
+      </w:r>
+      <w:r>
+        <w:rPr>
+          <w:b w:val="0"/>
+        </w:rPr>
+        <w:t xml:space="preserve"> la tabla muestra </w:t>
+      </w:r>
+      <w:r>
+        <w:rPr>
+          <w:b/>
+        </w:rPr>
+        <w:t>25 tickets por página</w:t>
+      </w:r>
+      <w:r>
+        <w:rPr>
+          <w:b w:val="0"/>
+        </w:rPr>
+        <w:t xml:space="preserve"> con paginador ("X tickets · Página N de M", ‹Anterior / Siguiente) sobre la lista </w:t>
+      </w:r>
+      <w:r>
+        <w:rPr>
+          <w:b/>
+        </w:rPr>
+        <w:t>ya ordenada por la cascada global</w:t>
+      </w:r>
+      <w:r>
+        <w:rPr>
+          <w:b w:val="0"/>
+        </w:rPr>
+        <w:t xml:space="preserve"> (la página 1 siempre contiene lo más urgente); cambiar orden, búsqueda o filtro regresa a la página 1. La API, por defecto, </w:t>
+      </w:r>
+      <w:r>
+        <w:rPr>
+          <w:b/>
+        </w:rPr>
+        <w:t>no carga el histórico</w:t>
+      </w:r>
+      <w:r>
+        <w:rPr>
+          <w:b w:val="0"/>
+        </w:rPr>
+        <w:t xml:space="preserve">: se queda con todos los tickets no cerrados (cualquier antigüedad — un pendiente viejo sigue siendo trabajo) + los cerrados de los últimos 30 días; </w:t>
       </w:r>
       <w:r>
         <w:rPr>
           <w:rFonts w:ascii="Consolas" w:hAnsi="Consolas"/>
           <w:color w:val="1F3B73"/>
         </w:rPr>
-        <w:t>[h]:mm:ss</w:t>
-      </w:r>
-      <w:r>
-        <w:rPr>
-          <w:b w:val="0"/>
-        </w:rPr>
-        <w:t>.</w:t>
+        <w:t>?todo=1</w:t>
+      </w:r>
+      <w:r>
+        <w:rPr>
+          <w:b w:val="0"/>
+        </w:rPr>
+        <w:t xml:space="preserve"> desactiva la ventana y el histórico completo vive en los </w:t>
+      </w:r>
+      <w:r>
+        <w:rPr>
+          <w:b/>
+        </w:rPr>
+        <w:t>Informes</w:t>
+      </w:r>
+      <w:r>
+        <w:rPr>
+          <w:b w:val="0"/>
+        </w:rPr>
+        <w:t>. Así el consumo del listado no crece con el tiempo (RNF-02).</w:t>
       </w:r>
     </w:p>
     <w:p>
@@ -1982,7 +2042,20 @@
         <w:rPr>
           <w:b w:val="0"/>
         </w:rPr>
-        <w:t>RF-012 Tomar, iniciar atención, liberar, reasignar dentro del grupo, resolver con notas (mín 8). Sin reasignar en validación.</w:t>
+        <w:t xml:space="preserve">RF-011 Columna Tiempo total (creado→resuelto o al momento) en </w:t>
+      </w:r>
+      <w:r>
+        <w:rPr>
+          <w:rFonts w:ascii="Consolas" w:hAnsi="Consolas"/>
+          <w:color w:val="1F3B73"/>
+        </w:rPr>
+        <w:t>[h]:mm:ss</w:t>
+      </w:r>
+      <w:r>
+        <w:rPr>
+          <w:b w:val="0"/>
+        </w:rPr>
+        <w:t>.</w:t>
       </w:r>
     </w:p>
     <w:p>
@@ -1993,22 +2066,33 @@
         <w:rPr>
           <w:b w:val="0"/>
         </w:rPr>
-        <w:t>RF-012b Rechazar con motivo obligatorio + evidencia opcional (lista y detalle, pegar Ctrl+V).</w:t>
+        <w:t>RF-012 Tomar, iniciar atención, liberar, reasignar dentro del grupo, resolver con notas (mín 8). Sin reasignar en validación.</w:t>
       </w:r>
     </w:p>
     <w:p>
       <w:pPr>
-        <w:pStyle w:val="Heading2"/>
-      </w:pPr>
-      <w:r>
-        <w:rPr>
-          <w:b w:val="0"/>
-        </w:rPr>
-        <w:t>RF-SLA</w:t>
+        <w:pStyle w:val="ListBullet"/>
+      </w:pPr>
+      <w:r>
+        <w:rPr>
+          <w:b w:val="0"/>
+        </w:rPr>
+        <w:t>RF-012b Rechazar con motivo obligatorio + evidencia opcional (lista y detalle, pegar Ctrl+V).</w:t>
       </w:r>
     </w:p>
     <w:p>
       <w:pPr>
+        <w:pStyle w:val="Heading2"/>
+      </w:pPr>
+      <w:r>
+        <w:rPr>
+          <w:b w:val="0"/>
+        </w:rPr>
+        <w:t>RF-SLA</w:t>
+      </w:r>
+    </w:p>
+    <w:p>
+      <w:pPr>
         <w:pStyle w:val="ListBullet"/>
       </w:pPr>
       <w:r>
@@ -3531,6 +3615,17 @@
           <w:b w:val="0"/>
         </w:rPr>
         <w:t>US-040 Como admin quiero que nadie cambie la clave de otro admin ni la del superadmin para blindar la escalada de privilegios. [RF-026b]</w:t>
+      </w:r>
+    </w:p>
+    <w:p>
+      <w:pPr>
+        <w:pStyle w:val="ListBullet"/>
+      </w:pPr>
+      <w:r>
+        <w:rPr>
+          <w:b w:val="0"/>
+        </w:rPr>
+        <w:t>US-041 Como despacho quiero que la bandeja muestre páginas de 25 tickets y que el sistema no descargue el histórico completo en cada carga. [RF-043]</w:t>
       </w:r>
     </w:p>
     <w:p>
@@ -5894,6 +5989,69 @@
             <w:r/>
             <w:r>
               <w:rPr>
+                <w:b w:val="0"/>
+              </w:rPr>
+              <w:t>Tag publicado</w:t>
+            </w:r>
+          </w:p>
+        </w:tc>
+      </w:tr>
+      <w:tr>
+        <w:tc>
+          <w:tcPr>
+            <w:tcW w:type="dxa" w:w="2880"/>
+          </w:tcPr>
+          <w:p>
+            <w:r/>
+            <w:r>
+              <w:rPr>
+                <w:b w:val="0"/>
+              </w:rPr>
+              <w:t>v1.8.9</w:t>
+            </w:r>
+          </w:p>
+        </w:tc>
+        <w:tc>
+          <w:tcPr>
+            <w:tcW w:type="dxa" w:w="2880"/>
+          </w:tcPr>
+          <w:p>
+            <w:r/>
+            <w:r>
+              <w:rPr>
+                <w:b/>
+              </w:rPr>
+              <w:t>Bandeja paginada y acotada (RF-043)</w:t>
+            </w:r>
+            <w:r>
+              <w:rPr>
+                <w:b w:val="0"/>
+              </w:rPr>
+              <w:t xml:space="preserve"> — 25 tickets por página con paginador sobre la lista ya ordenada por estado + prioridad (la página 1 siempre es lo más urgente; cambiar filtro u orden vuelve a la página 1); la API por defecto deja de cargar el histórico: todos los no cerrados (cualquier antigüedad) + cerrados de los últimos 30 días, con </w:t>
+            </w:r>
+            <w:r>
+              <w:rPr>
+                <w:rFonts w:ascii="Consolas" w:hAnsi="Consolas"/>
+                <w:color w:val="1F3B73"/>
+              </w:rPr>
+              <w:t>?todo=1</w:t>
+            </w:r>
+            <w:r>
+              <w:rPr>
+                <w:b w:val="0"/>
+              </w:rPr>
+              <w:t xml:space="preserve"> para el histórico completo. Consumo del listado estable con el tiempo (RNF-02)</w:t>
+            </w:r>
+          </w:p>
+        </w:tc>
+        <w:tc>
+          <w:tcPr>
+            <w:tcW w:type="dxa" w:w="2880"/>
+          </w:tcPr>
+          <w:p>
+            <w:r/>
+            <w:r>
+              <w:rPr>
                 <w:b/>
               </w:rPr>
               <w:t>Release actual</w:t>
@@ -6059,6 +6217,31 @@
           <w:b w:val="0"/>
         </w:rPr>
         <w:t xml:space="preserve"> (RF-004g incluida); </w:t>
+      </w:r>
+      <w:r>
+        <w:rPr>
+          <w:b/>
+        </w:rPr>
+        <w:t>42/42 OK en v1.8.9</w:t>
+      </w:r>
+      <w:r>
+        <w:rPr>
+          <w:b w:val="0"/>
+        </w:rPr>
+        <w:t xml:space="preserve"> (RF-043: ventana de la bandeja con pruebas de cerrado viejo/reciente y </w:t>
+      </w:r>
+      <w:r>
+        <w:rPr>
+          <w:rFonts w:ascii="Consolas" w:hAnsi="Consolas"/>
+          <w:color w:val="1F3B73"/>
+        </w:rPr>
+        <w:t>?todo=1</w:t>
+      </w:r>
+      <w:r>
+        <w:rPr>
+          <w:b w:val="0"/>
+        </w:rPr>
+        <w:t xml:space="preserve">); </w:t>
       </w:r>
       <w:r>
         <w:rPr>

</xml_diff>

<commit_message>
docs: historia de la bandeja paginada pasa a US-047 (habia dos US-041); .docx regenerado
</commit_message>
<xml_diff>
--- a/Evidencias y Documentacion/Ingenieria_Inversa_v1.8.0.docx
+++ b/Evidencias y Documentacion/Ingenieria_Inversa_v1.8.0.docx
@@ -3625,7 +3625,7 @@
         <w:rPr>
           <w:b w:val="0"/>
         </w:rPr>
-        <w:t>US-041 Como despacho quiero que la bandeja muestre páginas de 25 tickets y que el sistema no descargue el histórico completo en cada carga. [RF-043]</w:t>
+        <w:t>US-041 Como soporte quiero cambiarme solo entre Soporte A/B y los demás perfiles no toquen su equipo. [RF-026b]</w:t>
       </w:r>
     </w:p>
     <w:p>
@@ -3636,7 +3636,7 @@
         <w:rPr>
           <w:b w:val="0"/>
         </w:rPr>
-        <w:t>US-041 Como soporte quiero cambiarme solo entre Soporte A/B y los demás perfiles no toquen su equipo. [RF-026b]</w:t>
+        <w:t>US-042 Como equipo quiero desplegar en un server Ubuntu local con backups internos y acceso por VPN. [RNF-04/05/08]</w:t>
       </w:r>
     </w:p>
     <w:p>
@@ -3647,7 +3647,7 @@
         <w:rPr>
           <w:b w:val="0"/>
         </w:rPr>
-        <w:t>US-042 Como equipo quiero desplegar en un server Ubuntu local con backups internos y acceso por VPN. [RNF-04/05/08]</w:t>
+        <w:t>US-043 Como administrador quiero que un solo login quede activo por usuario, para que una sesión olvidada en otro equipo o pestaña no siga viva. [RF-004d]</w:t>
       </w:r>
     </w:p>
     <w:p>
@@ -3658,7 +3658,7 @@
         <w:rPr>
           <w:b w:val="0"/>
         </w:rPr>
-        <w:t>US-043 Como administrador quiero que un solo login quede activo por usuario, para que una sesión olvidada en otro equipo o pestaña no siga viva. [RF-004d]</w:t>
+        <w:t>US-044 Como usuario quiero que una pestaña nueva abra con mi sesión activa y que al cerrar sesión se cierren todas, sin reingresar pestaña por pestaña. [RF-004e]</w:t>
       </w:r>
     </w:p>
     <w:p>
@@ -3669,7 +3669,7 @@
         <w:rPr>
           <w:b w:val="0"/>
         </w:rPr>
-        <w:t>US-044 Como usuario quiero que una pestaña nueva abra con mi sesión activa y que al cerrar sesión se cierren todas, sin reingresar pestaña por pestaña. [RF-004e]</w:t>
+        <w:t>US-045 Como usuario quiero que al cerrar el navegador la sesión no quede viva en el equipo, sin que por eso se pierda al recargar la página. [RF-004f]</w:t>
       </w:r>
     </w:p>
     <w:p>
@@ -3680,7 +3680,7 @@
         <w:rPr>
           <w:b w:val="0"/>
         </w:rPr>
-        <w:t>US-045 Como usuario quiero que al cerrar el navegador la sesión no quede viva en el equipo, sin que por eso se pierda al recargar la página. [RF-004f]</w:t>
+        <w:t>US-046 Como administrador quiero que cada rol solo reciba los datos que su pantalla utiliza, para que un perfil de despacho no pueda consultar catálogos de otros grupos ni el panel de resumen vía API. [RF-004g]</w:t>
       </w:r>
     </w:p>
     <w:p>
@@ -3691,7 +3691,7 @@
         <w:rPr>
           <w:b w:val="0"/>
         </w:rPr>
-        <w:t>US-046 Como administrador quiero que cada rol solo reciba los datos que su pantalla utiliza, para que un perfil de despacho no pueda consultar catálogos de otros grupos ni el panel de resumen vía API. [RF-004g]</w:t>
+        <w:t>US-047 Como despacho quiero que la bandeja muestre páginas de 25 tickets y que el sistema no descargue el histórico completo en cada carga. [RF-043]</w:t>
       </w:r>
     </w:p>
     <w:p>

</xml_diff>

<commit_message>
v1.8.10: mostrar/ocultar contrasena (boton de ojo) en los 5 campos de clave (RF-044)
</commit_message>
<xml_diff>
--- a/Evidencias y Documentacion/Ingenieria_Inversa_v1.8.0.docx
+++ b/Evidencias y Documentacion/Ingenieria_Inversa_v1.8.0.docx
@@ -2890,22 +2890,45 @@
         <w:rPr>
           <w:b w:val="0"/>
         </w:rPr>
-        <w:t>RF-034 Tema claro/oscuro, paleta Tigo (#001EB4/#667EEA), responsive.</w:t>
+        <w:t xml:space="preserve">RF-044 </w:t>
+      </w:r>
+      <w:r>
+        <w:rPr>
+          <w:b/>
+        </w:rPr>
+        <w:t>Mostrar/ocultar contraseña (nuevo v1.8.10):</w:t>
+      </w:r>
+      <w:r>
+        <w:rPr>
+          <w:b w:val="0"/>
+        </w:rPr>
+        <w:t xml:space="preserve"> los cinco campos de clave de la aplicación (login, restablecimiento por enlace de correo, modal de usuario en Administración y los dos del restablecimiento por admin) incluyen un botón de ojo que alterna entre puntos y texto visible, con etiqueta accesible "Mostrar contraseña" / "Ocultar contraseña"; el valor, el autocomplete y las validaciones no cambian.</w:t>
       </w:r>
     </w:p>
     <w:p>
       <w:pPr>
-        <w:pStyle w:val="Heading2"/>
-      </w:pPr>
-      <w:r>
-        <w:rPr>
-          <w:b w:val="0"/>
-        </w:rPr>
-        <w:t>RF-AUD — Auditoría y superadmin</w:t>
+        <w:pStyle w:val="ListBullet"/>
+      </w:pPr>
+      <w:r>
+        <w:rPr>
+          <w:b w:val="0"/>
+        </w:rPr>
+        <w:t>RF-034 Tema claro/oscuro, paleta Tigo (#001EB4/#667EEA), responsive.</w:t>
       </w:r>
     </w:p>
     <w:p>
       <w:pPr>
+        <w:pStyle w:val="Heading2"/>
+      </w:pPr>
+      <w:r>
+        <w:rPr>
+          <w:b w:val="0"/>
+        </w:rPr>
+        <w:t>RF-AUD — Auditoría y superadmin</w:t>
+      </w:r>
+    </w:p>
+    <w:p>
+      <w:pPr>
         <w:pStyle w:val="ListBullet"/>
       </w:pPr>
       <w:r>
@@ -3692,6 +3715,17 @@
           <w:b w:val="0"/>
         </w:rPr>
         <w:t>US-047 Como despacho quiero que la bandeja muestre páginas de 25 tickets y que el sistema no descargue el histórico completo en cada carga. [RF-043]</w:t>
+      </w:r>
+    </w:p>
+    <w:p>
+      <w:pPr>
+        <w:pStyle w:val="ListBullet"/>
+      </w:pPr>
+      <w:r>
+        <w:rPr>
+          <w:b w:val="0"/>
+        </w:rPr>
+        <w:t>US-048 Como usuario quiero poder ver la contraseña que estoy escribiendo para comprobar que está bien antes de enviarla. [RF-044]</w:t>
       </w:r>
     </w:p>
     <w:p>
@@ -6052,6 +6086,56 @@
             <w:r/>
             <w:r>
               <w:rPr>
+                <w:b w:val="0"/>
+              </w:rPr>
+              <w:t>Tag publicado</w:t>
+            </w:r>
+          </w:p>
+        </w:tc>
+      </w:tr>
+      <w:tr>
+        <w:tc>
+          <w:tcPr>
+            <w:tcW w:type="dxa" w:w="2880"/>
+          </w:tcPr>
+          <w:p>
+            <w:r/>
+            <w:r>
+              <w:rPr>
+                <w:b w:val="0"/>
+              </w:rPr>
+              <w:t>v1.8.10</w:t>
+            </w:r>
+          </w:p>
+        </w:tc>
+        <w:tc>
+          <w:tcPr>
+            <w:tcW w:type="dxa" w:w="2880"/>
+          </w:tcPr>
+          <w:p>
+            <w:r/>
+            <w:r>
+              <w:rPr>
+                <w:b/>
+              </w:rPr>
+              <w:t>Mostrar/ocultar contraseña (RF-044)</w:t>
+            </w:r>
+            <w:r>
+              <w:rPr>
+                <w:b w:val="0"/>
+              </w:rPr>
+              <w:t xml:space="preserve"> — botón de ojo en los 5 campos de clave (login, restablecimiento por enlace de correo, modal de usuario en Administración y restablecimiento por admin) que alterna entre puntos y texto visible con etiqueta accesible; cambio solo de frontend</w:t>
+            </w:r>
+          </w:p>
+        </w:tc>
+        <w:tc>
+          <w:tcPr>
+            <w:tcW w:type="dxa" w:w="2880"/>
+          </w:tcPr>
+          <w:p>
+            <w:r/>
+            <w:r>
+              <w:rPr>
                 <w:b/>
               </w:rPr>
               <w:t>Release actual</w:t>

</xml_diff>

<commit_message>
v1.8.11: cuentas blindadas - edicion de usuario sin contrasena y correo/restablecimiento solo admin (RF-045)
</commit_message>
<xml_diff>
--- a/Evidencias y Documentacion/Ingenieria_Inversa_v1.8.0.docx
+++ b/Evidencias y Documentacion/Ingenieria_Inversa_v1.8.0.docx
@@ -2913,22 +2913,84 @@
         <w:rPr>
           <w:b w:val="0"/>
         </w:rPr>
-        <w:t>RF-034 Tema claro/oscuro, paleta Tigo (#001EB4/#667EEA), responsive.</w:t>
+        <w:t xml:space="preserve">RF-045 </w:t>
+      </w:r>
+      <w:r>
+        <w:rPr>
+          <w:b/>
+        </w:rPr>
+        <w:t>Cuentas blindadas en edición (nuevo v1.8.11):</w:t>
+      </w:r>
+      <w:r>
+        <w:rPr>
+          <w:b w:val="0"/>
+        </w:rPr>
+        <w:t xml:space="preserve"> la edición de usuario ya no incluye el campo de contraseña para ningún rol (la clave solo se restablece con el botón «Contraseña», hoy exclusivo de ADMIN, o por el propio usuario con «Olvidé mi contraseña») y el correo solo lo puede cambiar un administrador (para supervisor el campo queda de solo lectura); la API rechaza con 400 el </w:t>
+      </w:r>
+      <w:r>
+        <w:rPr>
+          <w:rFonts w:ascii="Consolas" w:hAnsi="Consolas"/>
+          <w:color w:val="1F3B73"/>
+        </w:rPr>
+        <w:t>password</w:t>
+      </w:r>
+      <w:r>
+        <w:rPr>
+          <w:b w:val="0"/>
+        </w:rPr>
+        <w:t xml:space="preserve"> o un cambio real de </w:t>
+      </w:r>
+      <w:r>
+        <w:rPr>
+          <w:rFonts w:ascii="Consolas" w:hAnsi="Consolas"/>
+          <w:color w:val="1F3B73"/>
+        </w:rPr>
+        <w:t>email</w:t>
+      </w:r>
+      <w:r>
+        <w:rPr>
+          <w:b w:val="0"/>
+        </w:rPr>
+        <w:t xml:space="preserve"> en </w:t>
+      </w:r>
+      <w:r>
+        <w:rPr>
+          <w:rFonts w:ascii="Consolas" w:hAnsi="Consolas"/>
+          <w:color w:val="1F3B73"/>
+        </w:rPr>
+        <w:t>PATCH /users/{id}</w:t>
+      </w:r>
+      <w:r>
+        <w:rPr>
+          <w:b w:val="0"/>
+        </w:rPr>
+        <w:t xml:space="preserve"> cuando el actor no es administrador, y conserva las reglas previas (admin no cambia la clave de otro admin ni la del superadmin).</w:t>
       </w:r>
     </w:p>
     <w:p>
       <w:pPr>
-        <w:pStyle w:val="Heading2"/>
-      </w:pPr>
-      <w:r>
-        <w:rPr>
-          <w:b w:val="0"/>
-        </w:rPr>
-        <w:t>RF-AUD — Auditoría y superadmin</w:t>
+        <w:pStyle w:val="ListBullet"/>
+      </w:pPr>
+      <w:r>
+        <w:rPr>
+          <w:b w:val="0"/>
+        </w:rPr>
+        <w:t>RF-034 Tema claro/oscuro, paleta Tigo (#001EB4/#667EEA), responsive.</w:t>
       </w:r>
     </w:p>
     <w:p>
       <w:pPr>
+        <w:pStyle w:val="Heading2"/>
+      </w:pPr>
+      <w:r>
+        <w:rPr>
+          <w:b w:val="0"/>
+        </w:rPr>
+        <w:t>RF-AUD — Auditoría y superadmin</w:t>
+      </w:r>
+    </w:p>
+    <w:p>
+      <w:pPr>
         <w:pStyle w:val="ListBullet"/>
       </w:pPr>
       <w:r>
@@ -3726,6 +3788,17 @@
           <w:b w:val="0"/>
         </w:rPr>
         <w:t>US-048 Como usuario quiero poder ver la contraseña que estoy escribiendo para comprobar que está bien antes de enviarla. [RF-044]</w:t>
+      </w:r>
+    </w:p>
+    <w:p>
+      <w:pPr>
+        <w:pStyle w:val="ListBullet"/>
+      </w:pPr>
+      <w:r>
+        <w:rPr>
+          <w:b w:val="0"/>
+        </w:rPr>
+        <w:t>US-049 Como administrador quiero que solo los administradores puedan restablecer contraseñas y cambiar el correo de las cuentas, y que la edición de usuarios no incluya la contraseña, para cerrar esa vía de cambio de credenciales. [RF-045]</w:t>
       </w:r>
     </w:p>
     <w:p>
@@ -6136,6 +6209,82 @@
             <w:r/>
             <w:r>
               <w:rPr>
+                <w:b w:val="0"/>
+              </w:rPr>
+              <w:t>Tag publicado</w:t>
+            </w:r>
+          </w:p>
+        </w:tc>
+      </w:tr>
+      <w:tr>
+        <w:tc>
+          <w:tcPr>
+            <w:tcW w:type="dxa" w:w="2880"/>
+          </w:tcPr>
+          <w:p>
+            <w:r/>
+            <w:r>
+              <w:rPr>
+                <w:b w:val="0"/>
+              </w:rPr>
+              <w:t>v1.8.11</w:t>
+            </w:r>
+          </w:p>
+        </w:tc>
+        <w:tc>
+          <w:tcPr>
+            <w:tcW w:type="dxa" w:w="2880"/>
+          </w:tcPr>
+          <w:p>
+            <w:r/>
+            <w:r>
+              <w:rPr>
+                <w:b/>
+              </w:rPr>
+              <w:t>Cuentas blindadas en edición (RF-045)</w:t>
+            </w:r>
+            <w:r>
+              <w:rPr>
+                <w:b w:val="0"/>
+              </w:rPr>
+              <w:t xml:space="preserve"> — el modal de edición ya no ofrece contraseña (ningún rol), el correo queda de solo lectura para supervisores y el botón «Contraseña» es exclusivo de ADMIN (antes también un supervisor podía restablecer claves); la API rechaza </w:t>
+            </w:r>
+            <w:r>
+              <w:rPr>
+                <w:rFonts w:ascii="Consolas" w:hAnsi="Consolas"/>
+                <w:color w:val="1F3B73"/>
+              </w:rPr>
+              <w:t>password</w:t>
+            </w:r>
+            <w:r>
+              <w:rPr>
+                <w:b w:val="0"/>
+              </w:rPr>
+              <w:t xml:space="preserve"> o un cambio de </w:t>
+            </w:r>
+            <w:r>
+              <w:rPr>
+                <w:rFonts w:ascii="Consolas" w:hAnsi="Consolas"/>
+                <w:color w:val="1F3B73"/>
+              </w:rPr>
+              <w:t>email</w:t>
+            </w:r>
+            <w:r>
+              <w:rPr>
+                <w:b w:val="0"/>
+              </w:rPr>
+              <w:t xml:space="preserve"> en PATCH de perfiles no administradores. Solo frontend+backend, sin migraciones</w:t>
+            </w:r>
+          </w:p>
+        </w:tc>
+        <w:tc>
+          <w:tcPr>
+            <w:tcW w:type="dxa" w:w="2880"/>
+          </w:tcPr>
+          <w:p>
+            <w:r/>
+            <w:r>
+              <w:rPr>
                 <w:b/>
               </w:rPr>
               <w:t>Release actual</w:t>
@@ -6326,6 +6475,18 @@
           <w:b w:val="0"/>
         </w:rPr>
         <w:t xml:space="preserve">); </w:t>
+      </w:r>
+      <w:r>
+        <w:rPr>
+          <w:b/>
+        </w:rPr>
+        <w:t>45/45 OK en v1.8.11</w:t>
+      </w:r>
+      <w:r>
+        <w:rPr>
+          <w:b w:val="0"/>
+        </w:rPr>
+        <w:t xml:space="preserve"> (RF-045: contraseña y correo blindados en edición de usuarios); </w:t>
       </w:r>
       <w:r>
         <w:rPr>

</xml_diff>

<commit_message>
v1.8.12: quita el aviso de texto del modal de edicion de usuarios (redundante, RF-045)
</commit_message>
<xml_diff>
--- a/Evidencias y Documentacion/Ingenieria_Inversa_v1.8.0.docx
+++ b/Evidencias y Documentacion/Ingenieria_Inversa_v1.8.0.docx
@@ -6285,6 +6285,56 @@
             <w:r/>
             <w:r>
               <w:rPr>
+                <w:b w:val="0"/>
+              </w:rPr>
+              <w:t>Tag publicado</w:t>
+            </w:r>
+          </w:p>
+        </w:tc>
+      </w:tr>
+      <w:tr>
+        <w:tc>
+          <w:tcPr>
+            <w:tcW w:type="dxa" w:w="2880"/>
+          </w:tcPr>
+          <w:p>
+            <w:r/>
+            <w:r>
+              <w:rPr>
+                <w:b w:val="0"/>
+              </w:rPr>
+              <w:t>v1.8.12</w:t>
+            </w:r>
+          </w:p>
+        </w:tc>
+        <w:tc>
+          <w:tcPr>
+            <w:tcW w:type="dxa" w:w="2880"/>
+          </w:tcPr>
+          <w:p>
+            <w:r/>
+            <w:r>
+              <w:rPr>
+                <w:b/>
+              </w:rPr>
+              <w:t>Ajuste de edición (RF-045)</w:t>
+            </w:r>
+            <w:r>
+              <w:rPr>
+                <w:b w:val="0"/>
+              </w:rPr>
+              <w:t xml:space="preserve"> — se elimina el aviso de texto del modal de edición de usuarios (resultaba redundante: el formulario ya no ofrece contraseña y el restablecimiento es solo de administración); cambio solo de frontend</w:t>
+            </w:r>
+          </w:p>
+        </w:tc>
+        <w:tc>
+          <w:tcPr>
+            <w:tcW w:type="dxa" w:w="2880"/>
+          </w:tcPr>
+          <w:p>
+            <w:r/>
+            <w:r>
+              <w:rPr>
                 <w:b/>
               </w:rPr>
               <w:t>Release actual</w:t>

</xml_diff>

<commit_message>
v1.8.13: build del frontend en Node 24 LTS (v24.22.1, fixes de seguridad 20/10/2026); node 20 estaba en EOL
</commit_message>
<xml_diff>
--- a/Evidencias y Documentacion/Ingenieria_Inversa_v1.8.0.docx
+++ b/Evidencias y Documentacion/Ingenieria_Inversa_v1.8.0.docx
@@ -6335,6 +6335,107 @@
             <w:r/>
             <w:r>
               <w:rPr>
+                <w:b w:val="0"/>
+              </w:rPr>
+              <w:t>Tag publicado</w:t>
+            </w:r>
+          </w:p>
+        </w:tc>
+      </w:tr>
+      <w:tr>
+        <w:tc>
+          <w:tcPr>
+            <w:tcW w:type="dxa" w:w="2880"/>
+          </w:tcPr>
+          <w:p>
+            <w:r/>
+            <w:r>
+              <w:rPr>
+                <w:b w:val="0"/>
+              </w:rPr>
+              <w:t>v1.8.13</w:t>
+            </w:r>
+          </w:p>
+        </w:tc>
+        <w:tc>
+          <w:tcPr>
+            <w:tcW w:type="dxa" w:w="2880"/>
+          </w:tcPr>
+          <w:p>
+            <w:r/>
+            <w:r>
+              <w:rPr>
+                <w:b/>
+              </w:rPr>
+              <w:t>Build del frontend en Node 24 LTS (seguridad)</w:t>
+            </w:r>
+            <w:r>
+              <w:rPr>
+                <w:b w:val="0"/>
+              </w:rPr>
+              <w:t xml:space="preserve"> — la etapa de build del </w:t>
+            </w:r>
+            <w:r>
+              <w:rPr>
+                <w:rFonts w:ascii="Consolas" w:hAnsi="Consolas"/>
+                <w:color w:val="1F3B73"/>
+              </w:rPr>
+              <w:t>Dockerfile.frontend</w:t>
+            </w:r>
+            <w:r>
+              <w:rPr>
+                <w:b w:val="0"/>
+              </w:rPr>
+              <w:t xml:space="preserve"> y el servicio dev pasan de </w:t>
+            </w:r>
+            <w:r>
+              <w:rPr>
+                <w:rFonts w:ascii="Consolas" w:hAnsi="Consolas"/>
+                <w:color w:val="1F3B73"/>
+              </w:rPr>
+              <w:t>node:20-alpine</w:t>
+            </w:r>
+            <w:r>
+              <w:rPr>
+                <w:b w:val="0"/>
+              </w:rPr>
+              <w:t xml:space="preserve"> (EOL desde abril 2026, fuera de los fixes de seguridad) a </w:t>
+            </w:r>
+            <w:r>
+              <w:rPr>
+                <w:rFonts w:ascii="Consolas" w:hAnsi="Consolas"/>
+                <w:color w:val="1F3B73"/>
+              </w:rPr>
+              <w:t>node:24-alpine</w:t>
+            </w:r>
+            <w:r>
+              <w:rPr>
+                <w:b w:val="0"/>
+              </w:rPr>
+              <w:t xml:space="preserve"> = </w:t>
+            </w:r>
+            <w:r>
+              <w:rPr>
+                <w:b/>
+              </w:rPr>
+              <w:t>v24.22.1</w:t>
+            </w:r>
+            <w:r>
+              <w:rPr>
+                <w:b w:val="0"/>
+              </w:rPr>
+              <w:t xml:space="preserve"> (LTS Krypton; release de seguridad del 20/10/2026 que también trajo 22.23.4 y 26.12.1). Imagen completa reconstruida y verificada con los mismos hashes de assets; nginx y runtime sin cambios. Los builds locales requieren Node ≥ 24.22.1</w:t>
+            </w:r>
+          </w:p>
+        </w:tc>
+        <w:tc>
+          <w:tcPr>
+            <w:tcW w:type="dxa" w:w="2880"/>
+          </w:tcPr>
+          <w:p>
+            <w:r/>
+            <w:r>
+              <w:rPr>
                 <w:b/>
               </w:rPr>
               <w:t>Release actual</w:t>

</xml_diff>